<commit_message>
feat:  minor bugs fix
</commit_message>
<xml_diff>
--- a/Resume.docx
+++ b/Resume.docx
@@ -33,139 +33,62 @@
     </w:p>
     <w:p>
       <w:pPr>
-        <w:spacing w:after="120" w:line="276" w:lineRule="auto"/>
+        <w:spacing w:after="0" w:line="276" w:lineRule="auto"/>
         <w:jc w:val="center"/>
-        <w:rPr>
-          <w:rFonts w:cstheme="minorHAnsi"/>
-        </w:rPr>
-      </w:pPr>
-      <w:r>
-        <w:rPr>
-          <w:rFonts w:cstheme="minorHAnsi"/>
-        </w:rPr>
-        <w:t xml:space="preserve">+91- 7986677845 </w:t>
-      </w:r>
-      <w:proofErr w:type="gramStart"/>
-      <w:r>
-        <w:rPr>
-          <w:rFonts w:cstheme="minorHAnsi"/>
-        </w:rPr>
-        <w:t xml:space="preserve">|  </w:t>
-      </w:r>
-      <w:proofErr w:type="gramEnd"/>
-      <w:r>
-        <w:fldChar w:fldCharType="begin"/>
-      </w:r>
-      <w:r>
-        <w:instrText xml:space="preserve"> HYPERLINK "mailto:sunnysaini.ldh@gmail.com" </w:instrText>
-      </w:r>
-      <w:r>
-        <w:fldChar w:fldCharType="separate"/>
-      </w:r>
-      <w:r>
-        <w:rPr>
-          <w:rStyle w:val="Hyperlink"/>
-          <w:rFonts w:cstheme="minorHAnsi"/>
-          <w:noProof/>
-        </w:rPr>
-        <w:t>sunnysaini.ldh@gmail.com</w:t>
-      </w:r>
-      <w:r>
-        <w:rPr>
-          <w:rStyle w:val="Hyperlink"/>
-          <w:rFonts w:cstheme="minorHAnsi"/>
-          <w:noProof/>
-        </w:rPr>
-        <w:fldChar w:fldCharType="end"/>
-      </w:r>
-      <w:r>
-        <w:rPr>
-          <w:rFonts w:cstheme="minorHAnsi"/>
-          <w:noProof/>
-        </w:rPr>
-        <w:t xml:space="preserve"> </w:t>
-      </w:r>
-      <w:r>
-        <w:rPr>
-          <w:rFonts w:cstheme="minorHAnsi"/>
-        </w:rPr>
-        <w:t xml:space="preserve">   </w:t>
-      </w:r>
-    </w:p>
-    <w:p>
-      <w:pPr>
-        <w:spacing w:after="120" w:line="276" w:lineRule="auto"/>
-        <w:jc w:val="center"/>
-        <w:rPr>
-          <w:rFonts w:cstheme="minorHAnsi"/>
-        </w:rPr>
-      </w:pPr>
-      <w:r>
-        <w:t xml:space="preserve">Portfolio: </w:t>
+      </w:pPr>
+      <w:r>
+        <w:t xml:space="preserve">+91 7986677845 | </w:t>
       </w:r>
       <w:hyperlink r:id="rId5" w:history="1">
         <w:r>
           <w:rPr>
             <w:rStyle w:val="Hyperlink"/>
-            <w:rFonts w:cstheme="minorHAnsi"/>
+            <w:u w:val="none"/>
           </w:rPr>
-          <w:t>https://sunnysaini2003.github.io/</w:t>
+          <w:t>sunnysaini.ldh@gmail.com</w:t>
         </w:r>
       </w:hyperlink>
       <w:r>
-        <w:rPr>
-          <w:rFonts w:cstheme="minorHAnsi"/>
-        </w:rPr>
-        <w:t xml:space="preserve">    </w:t>
-      </w:r>
-    </w:p>
-    <w:p>
-      <w:pPr>
-        <w:spacing w:after="120" w:line="276" w:lineRule="auto"/>
-        <w:jc w:val="center"/>
-        <w:rPr>
-          <w:rFonts w:cstheme="minorHAnsi"/>
-        </w:rPr>
-      </w:pPr>
-      <w:r>
-        <w:t xml:space="preserve">GitHub: </w:t>
+        <w:br/>
       </w:r>
       <w:hyperlink r:id="rId6" w:history="1">
         <w:r>
           <w:rPr>
             <w:rStyle w:val="Hyperlink"/>
-            <w:rFonts w:cstheme="minorHAnsi"/>
+            <w:u w:val="none"/>
           </w:rPr>
-          <w:t>https://github.com/Sunnysaini2003</w:t>
+          <w:t>sunnysaini2003.github.io</w:t>
         </w:r>
       </w:hyperlink>
       <w:r>
-        <w:rPr>
-          <w:rFonts w:cstheme="minorHAnsi"/>
-        </w:rPr>
-        <w:t xml:space="preserve"> </w:t>
-      </w:r>
-    </w:p>
-    <w:p>
-      <w:pPr>
-        <w:spacing w:after="120" w:line="276" w:lineRule="auto"/>
-        <w:jc w:val="center"/>
-        <w:rPr>
-          <w:rFonts w:cstheme="minorHAnsi"/>
-        </w:rPr>
-      </w:pPr>
-      <w:r>
-        <w:t xml:space="preserve">LinkedIn: </w:t>
+        <w:t xml:space="preserve"> | </w:t>
       </w:r>
       <w:hyperlink r:id="rId7" w:history="1">
         <w:r>
           <w:rPr>
             <w:rStyle w:val="Hyperlink"/>
-            <w:rFonts w:cstheme="minorHAnsi"/>
+            <w:u w:val="none"/>
           </w:rPr>
-          <w:t>https://www.linkedin.com/in/sunny-saini-0087b2301/</w:t>
+          <w:t>github.com/Sunnysaini2003</w:t>
         </w:r>
       </w:hyperlink>
+      <w:r>
+        <w:t xml:space="preserve"> | </w:t>
+      </w:r>
+      <w:hyperlink r:id="rId8" w:history="1">
+        <w:r>
+          <w:rPr>
+            <w:rStyle w:val="Hyperlink"/>
+            <w:u w:val="none"/>
+          </w:rPr>
+          <w:t>linkedin.com/in/sunny-saini-0087b2301</w:t>
+        </w:r>
+      </w:hyperlink>
+    </w:p>
+    <w:p>
+      <w:pPr>
+        <w:spacing w:after="0" w:line="276" w:lineRule="auto"/>
+      </w:pPr>
     </w:p>
     <w:p>
       <w:pPr>
@@ -192,20 +115,19 @@
       </w:r>
     </w:p>
     <w:p>
-      <w:pPr>
-        <w:spacing w:after="0" w:line="276" w:lineRule="auto"/>
-        <w:jc w:val="both"/>
-        <w:rPr>
-          <w:rFonts w:cstheme="minorHAnsi"/>
-        </w:rPr>
-      </w:pPr>
-      <w:r>
-        <w:rPr>
-          <w:rFonts w:cstheme="minorHAnsi"/>
-          <w:color w:val="000000" w:themeColor="text1"/>
-        </w:rPr>
-        <w:t>Full-stack web developer with hands-on experience in MERN stack, REST APIs, and database-driven applications. Experienced in building scalable web systems including project management and financial tracking platforms. Skilled in React, Node.js, Express, MongoDB, and MySQL with strong problem-solving and backend development capabilities.</w:t>
-      </w:r>
+      <w:r>
+        <w:t xml:space="preserve">Full-Stack MERN Developer with hands-on experience in building scalable web applications, RESTful APIs, and database-driven systems. Strong expertise in backend development, authentication, and CMS-based platforms. Proficient in React.js, Node.js, Express.js, MongoDB, and MySQL with a focus on performance optimization and clean code practices. Demonstrates strong problem-solving abilities and a continuous learning </w:t>
+      </w:r>
+      <w:proofErr w:type="spellStart"/>
+      <w:r>
+        <w:t>mindset</w:t>
+      </w:r>
+      <w:proofErr w:type="spellEnd"/>
+      <w:r>
+        <w:t>. Seeking a challenging full-stack developer role to contribute and grow in a professional environment.</w:t>
+      </w:r>
+      <w:bookmarkStart w:id="0" w:name="_GoBack"/>
+      <w:bookmarkEnd w:id="0"/>
     </w:p>
     <w:p>
       <w:pPr>
@@ -341,15 +263,10 @@
         </w:rPr>
       </w:pPr>
       <w:r>
-        <w:t xml:space="preserve">Full Stack </w:t>
-      </w:r>
-      <w:proofErr w:type="gramStart"/>
-      <w:r>
-        <w:t>Developer(</w:t>
-      </w:r>
-      <w:proofErr w:type="gramEnd"/>
-      <w:r>
-        <w:t>MERN)</w:t>
+        <w:rPr>
+          <w:b/>
+        </w:rPr>
+        <w:t>Junior Web Developer</w:t>
       </w:r>
       <w:r>
         <w:rPr>
@@ -404,7 +321,20 @@
           <w:rFonts w:eastAsia="Microsoft JhengHei" w:cstheme="minorHAnsi"/>
         </w:rPr>
         <w:tab/>
-        <w:t xml:space="preserve">                           Aug 2025– Present</w:t>
+        <w:t xml:space="preserve">                 </w:t>
+      </w:r>
+      <w:r>
+        <w:rPr>
+          <w:rFonts w:eastAsia="Microsoft JhengHei" w:cstheme="minorHAnsi"/>
+        </w:rPr>
+        <w:tab/>
+        <w:t xml:space="preserve">  </w:t>
+      </w:r>
+      <w:r>
+        <w:rPr>
+          <w:rFonts w:eastAsia="Microsoft JhengHei" w:cstheme="minorHAnsi"/>
+        </w:rPr>
+        <w:t xml:space="preserve">          Aug 2025– Present</w:t>
       </w:r>
     </w:p>
     <w:p>
@@ -421,16 +351,7 @@
         </w:rPr>
       </w:pPr>
       <w:r>
-        <w:rPr>
-          <w:rFonts w:eastAsia="Microsoft JhengHei" w:cstheme="minorHAnsi"/>
-        </w:rPr>
-        <w:t>Working on full-stack web development projects using MERN stack</w:t>
-      </w:r>
-      <w:r>
-        <w:rPr>
-          <w:rFonts w:eastAsia="Microsoft JhengHei" w:cstheme="minorHAnsi"/>
-        </w:rPr>
-        <w:t>.</w:t>
+        <w:t>Developing full-stack web applications using MERN stack with focus on scalability.</w:t>
       </w:r>
     </w:p>
     <w:p>
@@ -447,16 +368,7 @@
         </w:rPr>
       </w:pPr>
       <w:r>
-        <w:rPr>
-          <w:rFonts w:eastAsia="Microsoft JhengHei" w:cstheme="minorHAnsi"/>
-        </w:rPr>
-        <w:t>Handling live client websites and feature updates</w:t>
-      </w:r>
-      <w:r>
-        <w:rPr>
-          <w:rFonts w:eastAsia="Microsoft JhengHei" w:cstheme="minorHAnsi"/>
-        </w:rPr>
-        <w:t>.</w:t>
+        <w:t>Working on a custom CMS system to build dynamic features and functionality.</w:t>
       </w:r>
     </w:p>
     <w:p>
@@ -473,20 +385,366 @@
         </w:rPr>
       </w:pPr>
       <w:r>
-        <w:rPr>
-          <w:rFonts w:eastAsia="Microsoft JhengHei" w:cstheme="minorHAnsi"/>
-        </w:rPr>
-        <w:t>Developed RESTful APIs, authentication flows, and database-driven features following MVC architecture.</w:t>
-      </w:r>
-    </w:p>
-    <w:p>
-      <w:pPr>
+        <w:t>Creating reusable modules to improve development efficiency across projects.</w:t>
+      </w:r>
+    </w:p>
+    <w:p>
+      <w:pPr>
+        <w:pStyle w:val="ListParagraph"/>
+        <w:numPr>
+          <w:ilvl w:val="0"/>
+          <w:numId w:val="1"/>
+        </w:numPr>
         <w:spacing w:after="0" w:line="276" w:lineRule="auto"/>
         <w:jc w:val="both"/>
         <w:rPr>
           <w:rFonts w:eastAsia="Microsoft JhengHei" w:cstheme="minorHAnsi"/>
-          <w:b/>
-          <w:sz w:val="36"/>
+        </w:rPr>
+      </w:pPr>
+      <w:r>
+        <w:t>Building REST APIs, authentication systems, and optimizing performance.</w:t>
+      </w:r>
+    </w:p>
+    <w:p>
+      <w:pPr>
+        <w:spacing w:after="0" w:line="276" w:lineRule="auto"/>
+        <w:jc w:val="both"/>
+        <w:rPr>
+          <w:rFonts w:eastAsia="Microsoft JhengHei" w:cstheme="minorHAnsi"/>
+        </w:rPr>
+      </w:pPr>
+    </w:p>
+    <w:p>
+      <w:pPr>
+        <w:spacing w:after="0" w:line="276" w:lineRule="auto"/>
+        <w:jc w:val="both"/>
+        <w:rPr>
+          <w:rFonts w:eastAsia="Microsoft JhengHei" w:cstheme="minorHAnsi"/>
+          <w:i/>
+          <w:iCs/>
+        </w:rPr>
+      </w:pPr>
+      <w:proofErr w:type="spellStart"/>
+      <w:r>
+        <w:rPr>
+          <w:rFonts w:eastAsia="Microsoft JhengHei" w:cstheme="minorHAnsi"/>
+        </w:rPr>
+        <w:t>Devologix</w:t>
+      </w:r>
+      <w:proofErr w:type="spellEnd"/>
+      <w:r>
+        <w:rPr>
+          <w:rFonts w:eastAsia="Microsoft JhengHei" w:cstheme="minorHAnsi"/>
+        </w:rPr>
+        <w:t xml:space="preserve"> </w:t>
+      </w:r>
+      <w:r>
+        <w:rPr>
+          <w:rFonts w:cstheme="minorHAnsi"/>
+        </w:rPr>
+        <w:t>IT Solutions</w:t>
+      </w:r>
+      <w:r>
+        <w:rPr>
+          <w:rFonts w:eastAsia="Microsoft JhengHei" w:cstheme="minorHAnsi"/>
+        </w:rPr>
+        <w:tab/>
+      </w:r>
+      <w:r>
+        <w:rPr>
+          <w:rFonts w:eastAsia="Microsoft JhengHei" w:cstheme="minorHAnsi"/>
+        </w:rPr>
+        <w:tab/>
+      </w:r>
+      <w:r>
+        <w:rPr>
+          <w:rFonts w:eastAsia="Microsoft JhengHei" w:cstheme="minorHAnsi"/>
+        </w:rPr>
+        <w:tab/>
+      </w:r>
+      <w:r>
+        <w:rPr>
+          <w:rFonts w:eastAsia="Microsoft JhengHei" w:cstheme="minorHAnsi"/>
+        </w:rPr>
+        <w:tab/>
+      </w:r>
+      <w:r>
+        <w:rPr>
+          <w:rFonts w:eastAsia="Microsoft JhengHei" w:cstheme="minorHAnsi"/>
+        </w:rPr>
+        <w:tab/>
+      </w:r>
+      <w:r>
+        <w:rPr>
+          <w:rFonts w:eastAsia="Microsoft JhengHei" w:cstheme="minorHAnsi"/>
+        </w:rPr>
+        <w:tab/>
+      </w:r>
+      <w:r>
+        <w:rPr>
+          <w:rFonts w:eastAsia="Microsoft JhengHei" w:cstheme="minorHAnsi"/>
+        </w:rPr>
+        <w:tab/>
+      </w:r>
+      <w:r>
+        <w:rPr>
+          <w:rFonts w:eastAsia="Microsoft JhengHei" w:cstheme="minorHAnsi"/>
+        </w:rPr>
+        <w:tab/>
+      </w:r>
+      <w:r>
+        <w:rPr>
+          <w:rFonts w:eastAsia="Microsoft JhengHei" w:cstheme="minorHAnsi"/>
+        </w:rPr>
+        <w:tab/>
+      </w:r>
+      <w:r>
+        <w:rPr>
+          <w:rFonts w:eastAsia="Microsoft JhengHei" w:cstheme="minorHAnsi"/>
+        </w:rPr>
+        <w:tab/>
+      </w:r>
+      <w:r>
+        <w:rPr>
+          <w:rFonts w:eastAsia="Microsoft JhengHei" w:cstheme="minorHAnsi"/>
+        </w:rPr>
+        <w:tab/>
+        <w:t xml:space="preserve">     </w:t>
+      </w:r>
+      <w:r>
+        <w:rPr>
+          <w:rFonts w:eastAsia="Microsoft JhengHei" w:cstheme="minorHAnsi"/>
+          <w:i/>
+        </w:rPr>
+        <w:t>Punjab</w:t>
+      </w:r>
+      <w:r>
+        <w:rPr>
+          <w:rFonts w:eastAsia="Microsoft JhengHei" w:cstheme="minorHAnsi"/>
+          <w:i/>
+          <w:iCs/>
+        </w:rPr>
+        <w:t xml:space="preserve">, India </w:t>
+      </w:r>
+    </w:p>
+    <w:p>
+      <w:pPr>
+        <w:spacing w:after="0" w:line="276" w:lineRule="auto"/>
+        <w:rPr>
+          <w:rFonts w:eastAsia="Microsoft JhengHei" w:cstheme="minorHAnsi"/>
+        </w:rPr>
+      </w:pPr>
+      <w:r>
+        <w:rPr>
+          <w:rFonts w:eastAsia="Microsoft JhengHei" w:cstheme="minorHAnsi"/>
+          <w:b/>
+          <w:bCs/>
+        </w:rPr>
+        <w:t>Web Development Intern (Internship</w:t>
+      </w:r>
+      <w:r>
+        <w:rPr>
+          <w:rFonts w:eastAsia="Microsoft JhengHei" w:cstheme="minorHAnsi"/>
+          <w:b/>
+          <w:bCs/>
+        </w:rPr>
+        <w:t xml:space="preserve"> + Part Time</w:t>
+      </w:r>
+      <w:r>
+        <w:rPr>
+          <w:rFonts w:eastAsia="Microsoft JhengHei" w:cstheme="minorHAnsi"/>
+          <w:b/>
+          <w:bCs/>
+        </w:rPr>
+        <w:t>)</w:t>
+      </w:r>
+      <w:r>
+        <w:rPr>
+          <w:rFonts w:eastAsia="Microsoft JhengHei" w:cstheme="minorHAnsi"/>
+          <w:i/>
+          <w:iCs/>
+        </w:rPr>
+        <w:tab/>
+      </w:r>
+      <w:r>
+        <w:rPr>
+          <w:rFonts w:eastAsia="Microsoft JhengHei" w:cstheme="minorHAnsi"/>
+          <w:b/>
+          <w:bCs/>
+        </w:rPr>
+        <w:tab/>
+      </w:r>
+      <w:r>
+        <w:rPr>
+          <w:rFonts w:eastAsia="Microsoft JhengHei" w:cstheme="minorHAnsi"/>
+          <w:b/>
+          <w:bCs/>
+        </w:rPr>
+        <w:tab/>
+      </w:r>
+      <w:r>
+        <w:rPr>
+          <w:rFonts w:eastAsia="Microsoft JhengHei" w:cstheme="minorHAnsi"/>
+          <w:b/>
+          <w:bCs/>
+        </w:rPr>
+        <w:tab/>
+        <w:t xml:space="preserve">                     </w:t>
+      </w:r>
+      <w:r>
+        <w:rPr>
+          <w:rFonts w:eastAsia="Microsoft JhengHei" w:cstheme="minorHAnsi"/>
+          <w:b/>
+          <w:bCs/>
+        </w:rPr>
+        <w:tab/>
+        <w:t xml:space="preserve">             </w:t>
+      </w:r>
+      <w:r>
+        <w:rPr>
+          <w:rFonts w:eastAsia="Microsoft JhengHei" w:cstheme="minorHAnsi"/>
+        </w:rPr>
+        <w:t>Jul 2024 – Dec 2024</w:t>
+      </w:r>
+    </w:p>
+    <w:p>
+      <w:pPr>
+        <w:pStyle w:val="ListParagraph"/>
+        <w:numPr>
+          <w:ilvl w:val="0"/>
+          <w:numId w:val="20"/>
+        </w:numPr>
+        <w:spacing w:after="0" w:line="240" w:lineRule="auto"/>
+        <w:rPr>
+          <w:rFonts w:eastAsia="Times New Roman" w:cstheme="minorHAnsi"/>
+          <w:kern w:val="0"/>
+          <w:szCs w:val="24"/>
+          <w:lang w:val="en-US"/>
+          <w14:ligatures w14:val="none"/>
+        </w:rPr>
+      </w:pPr>
+      <w:r>
+        <w:rPr>
+          <w:rFonts w:eastAsia="Times New Roman" w:cstheme="minorHAnsi"/>
+          <w:kern w:val="0"/>
+          <w:szCs w:val="24"/>
+          <w:lang w:val="en-US"/>
+          <w14:ligatures w14:val="none"/>
+        </w:rPr>
+        <w:t xml:space="preserve">Worked on CMS-based dynamic websites </w:t>
+      </w:r>
+    </w:p>
+    <w:p>
+      <w:pPr>
+        <w:pStyle w:val="ListParagraph"/>
+        <w:numPr>
+          <w:ilvl w:val="0"/>
+          <w:numId w:val="20"/>
+        </w:numPr>
+        <w:spacing w:after="0" w:line="240" w:lineRule="auto"/>
+        <w:rPr>
+          <w:rFonts w:eastAsia="Times New Roman" w:cstheme="minorHAnsi"/>
+          <w:kern w:val="0"/>
+          <w:szCs w:val="24"/>
+          <w:lang w:val="en-US"/>
+          <w14:ligatures w14:val="none"/>
+        </w:rPr>
+      </w:pPr>
+      <w:r>
+        <w:rPr>
+          <w:rFonts w:eastAsia="Times New Roman" w:cstheme="minorHAnsi"/>
+          <w:kern w:val="0"/>
+          <w:szCs w:val="24"/>
+          <w:lang w:val="en-US"/>
+          <w14:ligatures w14:val="none"/>
+        </w:rPr>
+        <w:t xml:space="preserve">Customized and optimized HTML templates </w:t>
+      </w:r>
+    </w:p>
+    <w:p>
+      <w:pPr>
+        <w:pStyle w:val="ListParagraph"/>
+        <w:numPr>
+          <w:ilvl w:val="0"/>
+          <w:numId w:val="20"/>
+        </w:numPr>
+        <w:spacing w:after="0" w:line="240" w:lineRule="auto"/>
+        <w:rPr>
+          <w:rFonts w:eastAsia="Times New Roman" w:cstheme="minorHAnsi"/>
+          <w:kern w:val="0"/>
+          <w:szCs w:val="24"/>
+          <w:lang w:val="en-US"/>
+          <w14:ligatures w14:val="none"/>
+        </w:rPr>
+      </w:pPr>
+      <w:r>
+        <w:rPr>
+          <w:rFonts w:eastAsia="Times New Roman" w:cstheme="minorHAnsi"/>
+          <w:kern w:val="0"/>
+          <w:szCs w:val="24"/>
+          <w:lang w:val="en-US"/>
+          <w14:ligatures w14:val="none"/>
+        </w:rPr>
+        <w:t xml:space="preserve">Improved frontend-backend integration </w:t>
+      </w:r>
+    </w:p>
+    <w:p>
+      <w:pPr>
+        <w:pStyle w:val="ListParagraph"/>
+        <w:numPr>
+          <w:ilvl w:val="0"/>
+          <w:numId w:val="20"/>
+        </w:numPr>
+        <w:spacing w:after="0" w:line="240" w:lineRule="auto"/>
+        <w:rPr>
+          <w:rFonts w:eastAsia="Times New Roman" w:cstheme="minorHAnsi"/>
+          <w:kern w:val="0"/>
+          <w:szCs w:val="24"/>
+          <w:lang w:val="en-US"/>
+          <w14:ligatures w14:val="none"/>
+        </w:rPr>
+      </w:pPr>
+      <w:r>
+        <w:rPr>
+          <w:rFonts w:eastAsia="Times New Roman" w:cstheme="minorHAnsi"/>
+          <w:kern w:val="0"/>
+          <w:szCs w:val="24"/>
+          <w:lang w:val="en-US"/>
+          <w14:ligatures w14:val="none"/>
+        </w:rPr>
+        <w:t xml:space="preserve">Handled real client projects </w:t>
+      </w:r>
+    </w:p>
+    <w:p>
+      <w:pPr>
+        <w:pStyle w:val="ListParagraph"/>
+        <w:numPr>
+          <w:ilvl w:val="0"/>
+          <w:numId w:val="20"/>
+        </w:numPr>
+        <w:spacing w:after="0" w:line="276" w:lineRule="auto"/>
+        <w:rPr>
+          <w:rFonts w:cstheme="minorHAnsi"/>
+          <w:sz w:val="20"/>
+        </w:rPr>
+      </w:pPr>
+      <w:r>
+        <w:rPr>
+          <w:rFonts w:eastAsia="Times New Roman" w:cstheme="minorHAnsi"/>
+          <w:kern w:val="0"/>
+          <w:szCs w:val="24"/>
+          <w:lang w:val="en-US"/>
+          <w14:ligatures w14:val="none"/>
+        </w:rPr>
+        <w:t>Enhanced usability &amp; performance</w:t>
+      </w:r>
+    </w:p>
+    <w:p>
+      <w:pPr>
+        <w:spacing w:after="0" w:line="276" w:lineRule="auto"/>
+        <w:jc w:val="both"/>
+        <w:rPr>
+          <w:rFonts w:eastAsia="Microsoft JhengHei" w:cstheme="minorHAnsi"/>
         </w:rPr>
       </w:pPr>
       <w:r>
@@ -637,6 +895,53 @@
           <w:rFonts w:cstheme="minorHAnsi"/>
         </w:rPr>
         <w:t>Improved team coordination and task tracking efficiency through organized dashboards and real-time status visibility.</w:t>
+      </w:r>
+    </w:p>
+    <w:p>
+      <w:pPr>
+        <w:spacing w:after="0" w:line="276" w:lineRule="auto"/>
+        <w:rPr>
+          <w:rFonts w:cstheme="minorHAnsi"/>
+        </w:rPr>
+      </w:pPr>
+      <w:r>
+        <w:rPr>
+          <w:rFonts w:cstheme="minorHAnsi"/>
+          <w:b/>
+        </w:rPr>
+        <w:t>Tech Stack</w:t>
+      </w:r>
+      <w:r>
+        <w:rPr>
+          <w:rFonts w:cstheme="minorHAnsi"/>
+        </w:rPr>
+        <w:t xml:space="preserve">: </w:t>
+      </w:r>
+      <w:r>
+        <w:rPr>
+          <w:rFonts w:cstheme="minorHAnsi"/>
+        </w:rPr>
+        <w:t>MySQL, Express, Node.js</w:t>
+      </w:r>
+      <w:r>
+        <w:rPr>
+          <w:rFonts w:cstheme="minorHAnsi"/>
+        </w:rPr>
+        <w:t xml:space="preserve">, </w:t>
+      </w:r>
+      <w:proofErr w:type="spellStart"/>
+      <w:r>
+        <w:rPr>
+          <w:rFonts w:cstheme="minorHAnsi"/>
+        </w:rPr>
+        <w:t>Ejs</w:t>
+      </w:r>
+      <w:proofErr w:type="spellEnd"/>
+      <w:r>
+        <w:rPr>
+          <w:rFonts w:cstheme="minorHAnsi"/>
+        </w:rPr>
+        <w:t>, Bootstrap.</w:t>
       </w:r>
     </w:p>
     <w:p>
@@ -813,236 +1118,77 @@
     </w:p>
     <w:p>
       <w:pPr>
-        <w:pStyle w:val="ListParagraph"/>
         <w:spacing w:after="0" w:line="276" w:lineRule="auto"/>
-        <w:jc w:val="both"/>
-        <w:rPr>
-          <w:rFonts w:eastAsia="Microsoft JhengHei" w:cstheme="minorHAnsi"/>
-        </w:rPr>
-      </w:pPr>
-    </w:p>
-    <w:p>
-      <w:pPr>
-        <w:spacing w:after="0" w:line="276" w:lineRule="auto"/>
-        <w:jc w:val="both"/>
-        <w:rPr>
-          <w:rFonts w:eastAsia="Microsoft JhengHei" w:cstheme="minorHAnsi"/>
-          <w:i/>
-          <w:iCs/>
-        </w:rPr>
-      </w:pPr>
+        <w:rPr>
+          <w:rFonts w:cstheme="minorHAnsi"/>
+        </w:rPr>
+      </w:pPr>
+      <w:r>
+        <w:rPr>
+          <w:rFonts w:cstheme="minorHAnsi"/>
+          <w:b/>
+        </w:rPr>
+        <w:t>Tech Stack</w:t>
+      </w:r>
+      <w:r>
+        <w:rPr>
+          <w:rFonts w:cstheme="minorHAnsi"/>
+        </w:rPr>
+        <w:t xml:space="preserve">: </w:t>
+      </w:r>
+      <w:r>
+        <w:rPr>
+          <w:rFonts w:cstheme="minorHAnsi"/>
+        </w:rPr>
+        <w:t xml:space="preserve">MERN, </w:t>
+      </w:r>
+      <w:r>
+        <w:rPr>
+          <w:rFonts w:cstheme="minorHAnsi"/>
+        </w:rPr>
+        <w:t xml:space="preserve">MySQL, Express, Node.js, </w:t>
+      </w:r>
       <w:proofErr w:type="spellStart"/>
       <w:r>
         <w:rPr>
-          <w:rFonts w:eastAsia="Microsoft JhengHei" w:cstheme="minorHAnsi"/>
-        </w:rPr>
-        <w:t>Devologix</w:t>
+          <w:rFonts w:cstheme="minorHAnsi"/>
+        </w:rPr>
+        <w:t>Ejs</w:t>
       </w:r>
       <w:proofErr w:type="spellEnd"/>
       <w:r>
         <w:rPr>
-          <w:rFonts w:eastAsia="Microsoft JhengHei" w:cstheme="minorHAnsi"/>
-        </w:rPr>
-        <w:t xml:space="preserve"> </w:t>
-      </w:r>
-      <w:r>
-        <w:rPr>
-          <w:rFonts w:cstheme="minorHAnsi"/>
-        </w:rPr>
-        <w:t>IT Solutions</w:t>
-      </w:r>
-      <w:r>
-        <w:rPr>
-          <w:rFonts w:eastAsia="Microsoft JhengHei" w:cstheme="minorHAnsi"/>
-        </w:rPr>
-        <w:tab/>
-      </w:r>
-      <w:r>
-        <w:rPr>
-          <w:rFonts w:eastAsia="Microsoft JhengHei" w:cstheme="minorHAnsi"/>
-        </w:rPr>
-        <w:tab/>
-      </w:r>
-      <w:r>
-        <w:rPr>
-          <w:rFonts w:eastAsia="Microsoft JhengHei" w:cstheme="minorHAnsi"/>
-        </w:rPr>
-        <w:tab/>
-      </w:r>
-      <w:r>
-        <w:rPr>
-          <w:rFonts w:eastAsia="Microsoft JhengHei" w:cstheme="minorHAnsi"/>
-        </w:rPr>
-        <w:tab/>
-      </w:r>
-      <w:r>
-        <w:rPr>
-          <w:rFonts w:eastAsia="Microsoft JhengHei" w:cstheme="minorHAnsi"/>
-        </w:rPr>
-        <w:tab/>
-      </w:r>
-      <w:r>
-        <w:rPr>
-          <w:rFonts w:eastAsia="Microsoft JhengHei" w:cstheme="minorHAnsi"/>
-        </w:rPr>
-        <w:tab/>
-      </w:r>
-      <w:r>
-        <w:rPr>
-          <w:rFonts w:eastAsia="Microsoft JhengHei" w:cstheme="minorHAnsi"/>
-        </w:rPr>
-        <w:tab/>
-      </w:r>
-      <w:r>
-        <w:rPr>
-          <w:rFonts w:eastAsia="Microsoft JhengHei" w:cstheme="minorHAnsi"/>
-        </w:rPr>
-        <w:tab/>
-      </w:r>
-      <w:r>
-        <w:rPr>
-          <w:rFonts w:eastAsia="Microsoft JhengHei" w:cstheme="minorHAnsi"/>
-        </w:rPr>
-        <w:tab/>
-      </w:r>
-      <w:r>
-        <w:rPr>
-          <w:rFonts w:eastAsia="Microsoft JhengHei" w:cstheme="minorHAnsi"/>
-        </w:rPr>
-        <w:tab/>
-      </w:r>
-      <w:r>
-        <w:rPr>
-          <w:rFonts w:eastAsia="Microsoft JhengHei" w:cstheme="minorHAnsi"/>
-        </w:rPr>
-        <w:tab/>
-        <w:t xml:space="preserve">     </w:t>
-      </w:r>
-      <w:r>
-        <w:rPr>
-          <w:rFonts w:eastAsia="Microsoft JhengHei" w:cstheme="minorHAnsi"/>
-          <w:i/>
-        </w:rPr>
-        <w:t>Punjab</w:t>
-      </w:r>
-      <w:r>
-        <w:rPr>
-          <w:rFonts w:eastAsia="Microsoft JhengHei" w:cstheme="minorHAnsi"/>
-          <w:i/>
-          <w:iCs/>
-        </w:rPr>
-        <w:t xml:space="preserve">, India </w:t>
-      </w:r>
-    </w:p>
-    <w:p>
-      <w:pPr>
-        <w:spacing w:after="0" w:line="276" w:lineRule="auto"/>
-        <w:rPr>
-          <w:rFonts w:eastAsia="Microsoft JhengHei" w:cstheme="minorHAnsi"/>
-        </w:rPr>
-      </w:pPr>
-      <w:r>
-        <w:rPr>
-          <w:rFonts w:eastAsia="Microsoft JhengHei" w:cstheme="minorHAnsi"/>
-          <w:b/>
-          <w:bCs/>
-        </w:rPr>
-        <w:t>Web Development Intern (Academic Internship)</w:t>
-      </w:r>
-      <w:r>
-        <w:rPr>
-          <w:rFonts w:eastAsia="Microsoft JhengHei" w:cstheme="minorHAnsi"/>
-          <w:i/>
-          <w:iCs/>
-        </w:rPr>
-        <w:tab/>
-      </w:r>
-      <w:r>
-        <w:rPr>
-          <w:rFonts w:eastAsia="Microsoft JhengHei" w:cstheme="minorHAnsi"/>
-          <w:b/>
-          <w:bCs/>
-        </w:rPr>
-        <w:tab/>
-      </w:r>
-      <w:r>
-        <w:rPr>
-          <w:rFonts w:eastAsia="Microsoft JhengHei" w:cstheme="minorHAnsi"/>
-          <w:b/>
-          <w:bCs/>
-        </w:rPr>
-        <w:tab/>
-      </w:r>
-      <w:r>
-        <w:rPr>
-          <w:rFonts w:eastAsia="Microsoft JhengHei" w:cstheme="minorHAnsi"/>
-          <w:b/>
-          <w:bCs/>
-        </w:rPr>
-        <w:tab/>
-        <w:t xml:space="preserve">                     </w:t>
-      </w:r>
-      <w:r>
-        <w:rPr>
-          <w:rFonts w:eastAsia="Microsoft JhengHei" w:cstheme="minorHAnsi"/>
-          <w:b/>
-          <w:bCs/>
-        </w:rPr>
-        <w:tab/>
-        <w:t xml:space="preserve">             </w:t>
-      </w:r>
-      <w:r>
-        <w:rPr>
-          <w:rFonts w:eastAsia="Microsoft JhengHei" w:cstheme="minorHAnsi"/>
-        </w:rPr>
-        <w:t>Jul 2024 – Dec 2024</w:t>
-      </w:r>
-    </w:p>
-    <w:p>
-      <w:pPr>
-        <w:pStyle w:val="ListParagraph"/>
-        <w:numPr>
-          <w:ilvl w:val="0"/>
-          <w:numId w:val="2"/>
-        </w:numPr>
-        <w:spacing w:after="0" w:line="276" w:lineRule="auto"/>
-        <w:rPr>
-          <w:rFonts w:cstheme="minorHAnsi"/>
-        </w:rPr>
-      </w:pPr>
-      <w:r>
-        <w:rPr>
-          <w:rFonts w:cstheme="minorHAnsi"/>
-        </w:rPr>
-        <w:t>Completed a 6-month internship as part of 7th semester curriculum</w:t>
-      </w:r>
-    </w:p>
-    <w:p>
-      <w:pPr>
-        <w:pStyle w:val="ListParagraph"/>
-        <w:numPr>
-          <w:ilvl w:val="0"/>
-          <w:numId w:val="2"/>
-        </w:numPr>
-        <w:spacing w:after="0" w:line="276" w:lineRule="auto"/>
-        <w:rPr>
-          <w:rFonts w:cstheme="minorHAnsi"/>
-        </w:rPr>
-      </w:pPr>
-      <w:r>
-        <w:rPr>
-          <w:rFonts w:cstheme="minorHAnsi"/>
-        </w:rPr>
-        <w:t>Gained hands-on experience in frontend and backend development</w:t>
-      </w:r>
-    </w:p>
-    <w:p>
-      <w:pPr>
-        <w:spacing w:after="0" w:line="276" w:lineRule="auto"/>
-        <w:rPr>
-          <w:rFonts w:cstheme="minorHAnsi"/>
-        </w:rPr>
-      </w:pPr>
+          <w:rFonts w:cstheme="minorHAnsi"/>
+        </w:rPr>
+        <w:t xml:space="preserve">, </w:t>
+      </w:r>
+      <w:proofErr w:type="gramStart"/>
+      <w:r>
+        <w:rPr>
+          <w:rFonts w:cstheme="minorHAnsi"/>
+        </w:rPr>
+        <w:t>Bootstrap</w:t>
+      </w:r>
+      <w:proofErr w:type="gramEnd"/>
+      <w:r>
+        <w:rPr>
+          <w:rFonts w:cstheme="minorHAnsi"/>
+        </w:rPr>
+        <w:t>.</w:t>
+      </w:r>
+    </w:p>
+    <w:p>
+      <w:pPr>
+        <w:rPr>
+          <w:rFonts w:cstheme="minorHAnsi"/>
+        </w:rPr>
+      </w:pPr>
+      <w:r>
+        <w:rPr>
+          <w:rFonts w:cstheme="minorHAnsi"/>
+        </w:rPr>
+        <w:br w:type="page"/>
+      </w:r>
     </w:p>
     <w:p>
       <w:pPr>
@@ -1065,6 +1211,7 @@
           <w:sz w:val="24"/>
           <w:szCs w:val="24"/>
         </w:rPr>
+        <w:lastRenderedPageBreak/>
         <w:t xml:space="preserve">ACADEMIC </w:t>
       </w:r>
       <w:r>
@@ -1323,408 +1470,45 @@
     </w:p>
     <w:p>
       <w:pPr>
-        <w:spacing w:before="100" w:beforeAutospacing="1" w:after="0" w:line="240" w:lineRule="auto"/>
-        <w:rPr>
-          <w:rFonts w:eastAsia="Times New Roman" w:cstheme="minorHAnsi"/>
-          <w:iCs/>
-          <w:kern w:val="0"/>
-          <w:szCs w:val="24"/>
-          <w:lang w:val="en-US"/>
-          <w14:ligatures w14:val="none"/>
-        </w:rPr>
-      </w:pPr>
-      <w:r>
-        <w:rPr>
-          <w:rFonts w:eastAsia="Times New Roman" w:cstheme="minorHAnsi"/>
-          <w:b/>
-          <w:bCs/>
-          <w:kern w:val="0"/>
-          <w:szCs w:val="36"/>
-          <w:lang w:val="en-US"/>
-          <w14:ligatures w14:val="none"/>
-        </w:rPr>
-        <w:t>User Authentication &amp; Role Management System</w:t>
-      </w:r>
-      <w:r>
-        <w:rPr>
-          <w:rFonts w:eastAsia="Times New Roman" w:cstheme="minorHAnsi"/>
-          <w:b/>
-          <w:bCs/>
-          <w:kern w:val="0"/>
-          <w:szCs w:val="36"/>
-          <w:lang w:val="en-US"/>
-          <w14:ligatures w14:val="none"/>
-        </w:rPr>
-        <w:tab/>
-      </w:r>
-      <w:r>
-        <w:rPr>
-          <w:rFonts w:eastAsia="Times New Roman" w:cstheme="minorHAnsi"/>
-          <w:b/>
-          <w:bCs/>
-          <w:kern w:val="0"/>
-          <w:sz w:val="20"/>
-          <w:szCs w:val="36"/>
-          <w:lang w:val="en-US"/>
-          <w14:ligatures w14:val="none"/>
-        </w:rPr>
-        <w:tab/>
-      </w:r>
-      <w:r>
-        <w:rPr>
-          <w:rFonts w:eastAsia="Times New Roman" w:cstheme="minorHAnsi"/>
-          <w:b/>
-          <w:bCs/>
-          <w:kern w:val="0"/>
-          <w:sz w:val="20"/>
-          <w:szCs w:val="36"/>
-          <w:lang w:val="en-US"/>
-          <w14:ligatures w14:val="none"/>
-        </w:rPr>
-        <w:tab/>
-      </w:r>
-      <w:r>
-        <w:rPr>
-          <w:rFonts w:eastAsia="Times New Roman" w:cstheme="minorHAnsi"/>
-          <w:b/>
-          <w:bCs/>
-          <w:kern w:val="0"/>
-          <w:sz w:val="20"/>
-          <w:szCs w:val="36"/>
-          <w:lang w:val="en-US"/>
-          <w14:ligatures w14:val="none"/>
-        </w:rPr>
-        <w:tab/>
-      </w:r>
-      <w:r>
-        <w:rPr>
-          <w:rFonts w:eastAsia="Times New Roman" w:cstheme="minorHAnsi"/>
-          <w:b/>
-          <w:bCs/>
-          <w:kern w:val="0"/>
-          <w:sz w:val="20"/>
-          <w:szCs w:val="36"/>
-          <w:lang w:val="en-US"/>
-          <w14:ligatures w14:val="none"/>
-        </w:rPr>
-        <w:tab/>
-      </w:r>
-      <w:r>
-        <w:rPr>
-          <w:rFonts w:eastAsia="Times New Roman" w:cstheme="minorHAnsi"/>
-          <w:b/>
-          <w:bCs/>
-          <w:kern w:val="0"/>
-          <w:sz w:val="20"/>
-          <w:szCs w:val="36"/>
-          <w:lang w:val="en-US"/>
-          <w14:ligatures w14:val="none"/>
-        </w:rPr>
-        <w:tab/>
-        <w:t xml:space="preserve">       </w:t>
-      </w:r>
-      <w:r>
-        <w:rPr>
-          <w:rFonts w:eastAsia="Times New Roman" w:cstheme="minorHAnsi"/>
-          <w:b/>
-          <w:bCs/>
-          <w:kern w:val="0"/>
-          <w:sz w:val="20"/>
-          <w:szCs w:val="36"/>
-          <w:lang w:val="en-US"/>
-          <w14:ligatures w14:val="none"/>
-        </w:rPr>
-        <w:tab/>
-      </w:r>
-      <w:r>
-        <w:rPr>
-          <w:rFonts w:eastAsia="Times New Roman" w:cstheme="minorHAnsi"/>
-          <w:b/>
-          <w:bCs/>
-          <w:kern w:val="0"/>
-          <w:sz w:val="20"/>
-          <w:szCs w:val="36"/>
-          <w:lang w:val="en-US"/>
-          <w14:ligatures w14:val="none"/>
-        </w:rPr>
-        <w:t xml:space="preserve">  </w:t>
-      </w:r>
-      <w:r>
-        <w:rPr>
-          <w:rFonts w:eastAsia="Times New Roman" w:cstheme="minorHAnsi"/>
-          <w:b/>
-          <w:bCs/>
-          <w:kern w:val="0"/>
-          <w:sz w:val="20"/>
-          <w:szCs w:val="36"/>
-          <w:lang w:val="en-US"/>
-          <w14:ligatures w14:val="none"/>
-        </w:rPr>
-        <w:t xml:space="preserve"> </w:t>
-      </w:r>
-      <w:r>
-        <w:rPr>
-          <w:rFonts w:eastAsia="Times New Roman" w:cstheme="minorHAnsi"/>
-          <w:iCs/>
-          <w:kern w:val="0"/>
-          <w:szCs w:val="24"/>
-          <w:lang w:val="en-US"/>
-          <w14:ligatures w14:val="none"/>
-        </w:rPr>
-        <w:t>Nov/24 – Dec/24</w:t>
-      </w:r>
-    </w:p>
-    <w:p>
-      <w:pPr>
-        <w:pStyle w:val="ListParagraph"/>
-        <w:numPr>
-          <w:ilvl w:val="0"/>
-          <w:numId w:val="17"/>
-        </w:numPr>
-        <w:rPr>
-          <w:rStyle w:val="Strong"/>
-          <w:rFonts w:cstheme="minorHAnsi"/>
-          <w:b w:val="0"/>
-          <w:bCs w:val="0"/>
-        </w:rPr>
-      </w:pPr>
-      <w:r>
-        <w:rPr>
-          <w:rStyle w:val="Strong"/>
-          <w:rFonts w:cstheme="minorHAnsi"/>
-          <w:b w:val="0"/>
-          <w:bCs w:val="0"/>
-        </w:rPr>
-        <w:t>Built a secure authentication system with user registration, login, and role-based access control for web applications.</w:t>
-      </w:r>
-    </w:p>
-    <w:p>
-      <w:pPr>
-        <w:pStyle w:val="ListParagraph"/>
-        <w:numPr>
-          <w:ilvl w:val="0"/>
-          <w:numId w:val="17"/>
-        </w:numPr>
-        <w:rPr>
-          <w:rStyle w:val="Strong"/>
-          <w:rFonts w:cstheme="minorHAnsi"/>
-          <w:b w:val="0"/>
-          <w:bCs w:val="0"/>
-        </w:rPr>
-      </w:pPr>
-      <w:r>
-        <w:rPr>
-          <w:rStyle w:val="Strong"/>
-          <w:rFonts w:cstheme="minorHAnsi"/>
-          <w:b w:val="0"/>
-          <w:bCs w:val="0"/>
-        </w:rPr>
-        <w:lastRenderedPageBreak/>
-        <w:t>Implemented session handling, password hashing, and protected routes to ensure application security.</w:t>
-      </w:r>
-    </w:p>
-    <w:p>
-      <w:pPr>
-        <w:pStyle w:val="ListParagraph"/>
-        <w:numPr>
-          <w:ilvl w:val="0"/>
-          <w:numId w:val="17"/>
-        </w:numPr>
         <w:spacing w:after="0" w:line="276" w:lineRule="auto"/>
         <w:rPr>
-          <w:rStyle w:val="Strong"/>
-          <w:rFonts w:cstheme="minorHAnsi"/>
-          <w:b w:val="0"/>
-          <w:bCs w:val="0"/>
-        </w:rPr>
-      </w:pPr>
-      <w:r>
-        <w:rPr>
-          <w:rStyle w:val="Strong"/>
-          <w:rFonts w:cstheme="minorHAnsi"/>
-          <w:b w:val="0"/>
-          <w:bCs w:val="0"/>
-        </w:rPr>
-        <w:t>Strengthened backend security understanding and enabled scalable user permission management.</w:t>
-      </w:r>
-    </w:p>
-    <w:p>
-      <w:pPr>
-        <w:rPr>
-          <w:rFonts w:eastAsia="Microsoft JhengHei" w:cstheme="minorHAnsi"/>
-          <w:b/>
-          <w:bCs/>
-        </w:rPr>
-      </w:pPr>
-      <w:r>
-        <w:rPr>
-          <w:rFonts w:eastAsia="Microsoft JhengHei" w:cstheme="minorHAnsi"/>
-          <w:b/>
-          <w:bCs/>
-        </w:rPr>
-        <w:t>Spam Email Detection System</w:t>
-      </w:r>
-      <w:r>
-        <w:rPr>
-          <w:rFonts w:eastAsia="Microsoft JhengHei" w:cstheme="minorHAnsi"/>
-        </w:rPr>
-        <w:tab/>
-      </w:r>
-      <w:r>
-        <w:rPr>
-          <w:rFonts w:eastAsia="Microsoft JhengHei" w:cstheme="minorHAnsi"/>
-        </w:rPr>
-        <w:tab/>
-      </w:r>
-      <w:r>
-        <w:rPr>
-          <w:rFonts w:eastAsia="Microsoft JhengHei" w:cstheme="minorHAnsi"/>
-        </w:rPr>
-        <w:tab/>
-      </w:r>
-      <w:r>
-        <w:rPr>
-          <w:rFonts w:eastAsia="Microsoft JhengHei" w:cstheme="minorHAnsi"/>
-        </w:rPr>
-        <w:tab/>
-      </w:r>
-      <w:r>
-        <w:rPr>
-          <w:rFonts w:eastAsia="Microsoft JhengHei" w:cstheme="minorHAnsi"/>
-        </w:rPr>
-        <w:tab/>
-      </w:r>
-      <w:r>
-        <w:rPr>
-          <w:rFonts w:eastAsia="Microsoft JhengHei" w:cstheme="minorHAnsi"/>
-        </w:rPr>
-        <w:tab/>
-      </w:r>
-      <w:r>
-        <w:rPr>
-          <w:rFonts w:eastAsia="Microsoft JhengHei" w:cstheme="minorHAnsi"/>
-        </w:rPr>
-        <w:tab/>
-        <w:t xml:space="preserve">      </w:t>
-      </w:r>
-      <w:r>
-        <w:rPr>
-          <w:rFonts w:eastAsia="Microsoft JhengHei" w:cstheme="minorHAnsi"/>
-        </w:rPr>
-        <w:t xml:space="preserve">    </w:t>
-      </w:r>
-      <w:r>
-        <w:rPr>
-          <w:rFonts w:eastAsia="Microsoft JhengHei" w:cstheme="minorHAnsi"/>
-        </w:rPr>
-        <w:tab/>
-      </w:r>
-      <w:r>
-        <w:rPr>
-          <w:rFonts w:eastAsia="Microsoft JhengHei" w:cstheme="minorHAnsi"/>
-        </w:rPr>
-        <w:tab/>
-      </w:r>
-      <w:r>
-        <w:rPr>
-          <w:rFonts w:eastAsia="Microsoft JhengHei" w:cstheme="minorHAnsi"/>
-        </w:rPr>
-        <w:tab/>
-      </w:r>
-      <w:r>
-        <w:rPr>
-          <w:rFonts w:eastAsia="Microsoft JhengHei" w:cstheme="minorHAnsi"/>
-        </w:rPr>
-        <w:t>Aug/24– Sep/24</w:t>
-      </w:r>
-    </w:p>
-    <w:p>
-      <w:pPr>
-        <w:pStyle w:val="ListParagraph"/>
-        <w:numPr>
-          <w:ilvl w:val="0"/>
-          <w:numId w:val="5"/>
-        </w:numPr>
-        <w:spacing w:afterLines="20" w:after="48" w:line="276" w:lineRule="auto"/>
-        <w:jc w:val="both"/>
-        <w:rPr>
-          <w:rFonts w:cstheme="minorHAnsi"/>
-        </w:rPr>
-      </w:pPr>
-      <w:r>
-        <w:rPr>
-          <w:rFonts w:cstheme="minorHAnsi"/>
-        </w:rPr>
-        <w:t xml:space="preserve">Developed a machine learning solution to classify emails as spam or non-spam by </w:t>
+          <w:rFonts w:cstheme="minorHAnsi"/>
+        </w:rPr>
+      </w:pPr>
+      <w:r>
+        <w:rPr>
+          <w:rFonts w:cstheme="minorHAnsi"/>
+          <w:b/>
+        </w:rPr>
+        <w:t>T</w:t>
+      </w:r>
+      <w:r>
+        <w:rPr>
+          <w:rFonts w:cstheme="minorHAnsi"/>
+          <w:b/>
+        </w:rPr>
+        <w:t>ech Stack</w:t>
+      </w:r>
+      <w:r>
+        <w:rPr>
+          <w:rFonts w:cstheme="minorHAnsi"/>
+        </w:rPr>
+        <w:t xml:space="preserve">: MySQL, Express, Node.js, </w:t>
       </w:r>
       <w:proofErr w:type="spellStart"/>
       <w:r>
         <w:rPr>
           <w:rFonts w:cstheme="minorHAnsi"/>
         </w:rPr>
-        <w:t>analyzing</w:t>
+        <w:t>Ejs</w:t>
       </w:r>
       <w:proofErr w:type="spellEnd"/>
       <w:r>
         <w:rPr>
           <w:rFonts w:cstheme="minorHAnsi"/>
         </w:rPr>
-        <w:t xml:space="preserve"> email content.</w:t>
-      </w:r>
-    </w:p>
-    <w:p>
-      <w:pPr>
-        <w:pStyle w:val="ListParagraph"/>
-        <w:numPr>
-          <w:ilvl w:val="0"/>
-          <w:numId w:val="5"/>
-        </w:numPr>
-        <w:spacing w:afterLines="20" w:after="48" w:line="276" w:lineRule="auto"/>
-        <w:jc w:val="both"/>
-        <w:rPr>
-          <w:rFonts w:cstheme="minorHAnsi"/>
-        </w:rPr>
-      </w:pPr>
-      <w:r>
-        <w:rPr>
-          <w:rFonts w:cstheme="minorHAnsi"/>
-        </w:rPr>
-        <w:t>Used Python with Naïve Bayes algorithm, text pre-processing, and NLP techniques for feature extraction.</w:t>
-      </w:r>
-    </w:p>
-    <w:p>
-      <w:pPr>
-        <w:pStyle w:val="ListParagraph"/>
-        <w:numPr>
-          <w:ilvl w:val="0"/>
-          <w:numId w:val="5"/>
-        </w:numPr>
-        <w:spacing w:afterLines="20" w:after="48" w:line="276" w:lineRule="auto"/>
-        <w:jc w:val="both"/>
-        <w:rPr>
-          <w:rFonts w:cstheme="minorHAnsi"/>
-          <w:sz w:val="20"/>
-          <w:szCs w:val="20"/>
-        </w:rPr>
-      </w:pPr>
-      <w:r>
-        <w:rPr>
-          <w:rFonts w:cstheme="minorHAnsi"/>
-        </w:rPr>
-        <w:t>Improved email filtering accuracy by automatically detecting and reducing spam emails.</w:t>
-      </w:r>
-    </w:p>
-    <w:p>
-      <w:pPr>
-        <w:pStyle w:val="ListParagraph"/>
-        <w:spacing w:afterLines="20" w:after="48" w:line="276" w:lineRule="auto"/>
-        <w:jc w:val="both"/>
-        <w:rPr>
-          <w:rFonts w:cstheme="minorHAnsi"/>
-          <w:sz w:val="20"/>
-          <w:szCs w:val="20"/>
-        </w:rPr>
-      </w:pPr>
+        <w:t>, Bootstrap.</w:t>
+      </w:r>
     </w:p>
     <w:p>
       <w:pPr>
@@ -1877,6 +1661,61 @@
           <w:rFonts w:cstheme="minorHAnsi"/>
         </w:rPr>
       </w:pPr>
+      <w:r>
+        <w:rPr>
+          <w:rFonts w:cstheme="minorHAnsi"/>
+          <w:b/>
+        </w:rPr>
+        <w:t>Tech Stack</w:t>
+      </w:r>
+      <w:r>
+        <w:rPr>
+          <w:rFonts w:cstheme="minorHAnsi"/>
+        </w:rPr>
+        <w:t xml:space="preserve">: </w:t>
+      </w:r>
+      <w:r>
+        <w:rPr>
+          <w:rFonts w:cstheme="minorHAnsi"/>
+        </w:rPr>
+        <w:t xml:space="preserve">Python, </w:t>
+      </w:r>
+      <w:proofErr w:type="spellStart"/>
+      <w:r>
+        <w:rPr>
+          <w:rFonts w:cstheme="minorHAnsi"/>
+        </w:rPr>
+        <w:t>Streamlit</w:t>
+      </w:r>
+      <w:proofErr w:type="spellEnd"/>
+      <w:r>
+        <w:rPr>
+          <w:rFonts w:cstheme="minorHAnsi"/>
+        </w:rPr>
+        <w:t xml:space="preserve">, </w:t>
+      </w:r>
+      <w:proofErr w:type="spellStart"/>
+      <w:r>
+        <w:rPr>
+          <w:rFonts w:cstheme="minorHAnsi"/>
+        </w:rPr>
+        <w:t>psutil</w:t>
+      </w:r>
+      <w:proofErr w:type="spellEnd"/>
+      <w:r>
+        <w:rPr>
+          <w:rFonts w:cstheme="minorHAnsi"/>
+        </w:rPr>
+        <w:t>.</w:t>
+      </w:r>
+    </w:p>
+    <w:p>
+      <w:pPr>
+        <w:spacing w:after="0" w:line="276" w:lineRule="auto"/>
+        <w:rPr>
+          <w:rFonts w:cstheme="minorHAnsi"/>
+        </w:rPr>
+      </w:pPr>
     </w:p>
     <w:p>
       <w:pPr>
@@ -2442,8 +2281,6 @@
         </w:rPr>
         <w:t>React Web Developer Certification</w:t>
       </w:r>
-      <w:bookmarkStart w:id="0" w:name="_GoBack"/>
-      <w:bookmarkEnd w:id="0"/>
     </w:p>
     <w:p>
       <w:pPr>
@@ -2585,139 +2422,69 @@
       </w:r>
     </w:p>
     <w:p>
-      <w:pPr>
-        <w:rPr>
-          <w:rStyle w:val="Strong"/>
-        </w:rPr>
-      </w:pPr>
-      <w:r>
-        <w:rPr>
-          <w:rStyle w:val="Strong"/>
-        </w:rPr>
-        <w:t xml:space="preserve">Programming: </w:t>
-      </w:r>
-      <w:r>
-        <w:rPr>
-          <w:rStyle w:val="Strong"/>
-          <w:b w:val="0"/>
-        </w:rPr>
-        <w:t>JavaScript, Python</w:t>
-      </w:r>
-      <w:r>
-        <w:rPr>
-          <w:rStyle w:val="Strong"/>
-          <w:b w:val="0"/>
-        </w:rPr>
-        <w:t xml:space="preserve">, </w:t>
-      </w:r>
-      <w:proofErr w:type="spellStart"/>
-      <w:r>
-        <w:rPr>
-          <w:rStyle w:val="Strong"/>
-          <w:b w:val="0"/>
-        </w:rPr>
-        <w:t>Javascript</w:t>
-      </w:r>
-      <w:proofErr w:type="spellEnd"/>
-    </w:p>
-    <w:p>
-      <w:pPr>
-        <w:rPr>
-          <w:rStyle w:val="Strong"/>
-        </w:rPr>
-      </w:pPr>
-      <w:r>
-        <w:rPr>
-          <w:rStyle w:val="Strong"/>
-        </w:rPr>
-        <w:t xml:space="preserve">Frontend: </w:t>
-      </w:r>
-      <w:r>
-        <w:rPr>
-          <w:rStyle w:val="Strong"/>
-          <w:b w:val="0"/>
-        </w:rPr>
-        <w:t>React.js, HTML5, CSS3</w:t>
-      </w:r>
-    </w:p>
-    <w:p>
-      <w:pPr>
-        <w:rPr>
-          <w:rStyle w:val="Strong"/>
-        </w:rPr>
-      </w:pPr>
-      <w:r>
-        <w:rPr>
-          <w:rStyle w:val="Strong"/>
-        </w:rPr>
-        <w:t xml:space="preserve">Backend: </w:t>
-      </w:r>
-      <w:r>
-        <w:rPr>
-          <w:rStyle w:val="Strong"/>
-          <w:b w:val="0"/>
-        </w:rPr>
-        <w:t>Node.js, Express.js</w:t>
-      </w:r>
-    </w:p>
-    <w:p>
-      <w:pPr>
-        <w:rPr>
-          <w:rStyle w:val="Strong"/>
-        </w:rPr>
-      </w:pPr>
-      <w:r>
-        <w:rPr>
-          <w:rStyle w:val="Strong"/>
-        </w:rPr>
-        <w:t xml:space="preserve">Databases: </w:t>
-      </w:r>
-      <w:r>
-        <w:rPr>
-          <w:rStyle w:val="Strong"/>
-          <w:b w:val="0"/>
-        </w:rPr>
-        <w:t>MongoDB, MySQL</w:t>
-      </w:r>
-    </w:p>
-    <w:p>
-      <w:pPr>
-        <w:rPr>
-          <w:rStyle w:val="Strong"/>
-        </w:rPr>
-      </w:pPr>
-      <w:r>
-        <w:rPr>
-          <w:rStyle w:val="Strong"/>
-        </w:rPr>
-        <w:t xml:space="preserve">Tools: </w:t>
-      </w:r>
-      <w:r>
-        <w:rPr>
-          <w:rStyle w:val="Strong"/>
-          <w:b w:val="0"/>
-        </w:rPr>
-        <w:t>Git, Postman, VS Code</w:t>
-      </w:r>
-    </w:p>
-    <w:p>
-      <w:pPr>
-        <w:rPr>
-          <w:rFonts w:cstheme="minorHAnsi"/>
-        </w:rPr>
-      </w:pPr>
-      <w:r>
-        <w:rPr>
-          <w:rStyle w:val="Strong"/>
-        </w:rPr>
-        <w:t xml:space="preserve">Platforms: </w:t>
-      </w:r>
-      <w:r>
-        <w:rPr>
-          <w:rStyle w:val="Strong"/>
-          <w:b w:val="0"/>
-        </w:rPr>
-        <w:t>WordPress, Shopify</w:t>
+      <w:r>
+        <w:rPr>
+          <w:b/>
+        </w:rPr>
+        <w:t>Frontend:</w:t>
+      </w:r>
+      <w:r>
+        <w:t xml:space="preserve"> HTML5, CSS3, React.js  </w:t>
+      </w:r>
+    </w:p>
+    <w:p>
+      <w:r>
+        <w:rPr>
+          <w:b/>
+        </w:rPr>
+        <w:t>Backend:</w:t>
+      </w:r>
+      <w:r>
+        <w:t xml:space="preserve"> Node.js, Express.js</w:t>
+      </w:r>
+    </w:p>
+    <w:p>
+      <w:r>
+        <w:rPr>
+          <w:b/>
+        </w:rPr>
+        <w:t>Programming:</w:t>
+      </w:r>
+      <w:r>
+        <w:t xml:space="preserve"> JavaScript, Python, Java  </w:t>
+      </w:r>
+    </w:p>
+    <w:p>
+      <w:r>
+        <w:rPr>
+          <w:b/>
+        </w:rPr>
+        <w:t>Databases:</w:t>
+      </w:r>
+      <w:r>
+        <w:t xml:space="preserve"> MongoDB, MySQL  </w:t>
+      </w:r>
+    </w:p>
+    <w:p>
+      <w:r>
+        <w:rPr>
+          <w:b/>
+        </w:rPr>
+        <w:t>Tools:</w:t>
+      </w:r>
+      <w:r>
+        <w:t xml:space="preserve"> Git, Postman, VS Code  </w:t>
+      </w:r>
+    </w:p>
+    <w:p>
+      <w:r>
+        <w:rPr>
+          <w:b/>
+        </w:rPr>
+        <w:t>Platforms:</w:t>
+      </w:r>
+      <w:r>
+        <w:t xml:space="preserve"> WordPress, Shopify</w:t>
       </w:r>
     </w:p>
     <w:sectPr>
@@ -2846,6 +2613,119 @@
     </w:lvl>
   </w:abstractNum>
   <w:abstractNum w:abstractNumId="1" w15:restartNumberingAfterBreak="0">
+    <w:nsid w:val="0C607314"/>
+    <w:multiLevelType w:val="hybridMultilevel"/>
+    <w:tmpl w:val="25AA4D10"/>
+    <w:lvl w:ilvl="0" w:tplc="0A12B95E">
+      <w:start w:val="1"/>
+      <w:numFmt w:val="bullet"/>
+      <w:lvlText w:val=""/>
+      <w:lvlJc w:val="left"/>
+      <w:pPr>
+        <w:ind w:left="720" w:hanging="360"/>
+      </w:pPr>
+      <w:rPr>
+        <w:rFonts w:ascii="Wingdings 2" w:hAnsi="Wingdings 2" w:hint="default"/>
+      </w:rPr>
+    </w:lvl>
+    <w:lvl w:ilvl="1" w:tplc="04090003" w:tentative="1">
+      <w:start w:val="1"/>
+      <w:numFmt w:val="bullet"/>
+      <w:lvlText w:val="o"/>
+      <w:lvlJc w:val="left"/>
+      <w:pPr>
+        <w:ind w:left="1440" w:hanging="360"/>
+      </w:pPr>
+      <w:rPr>
+        <w:rFonts w:ascii="OCR A Std" w:hAnsi="OCR A Std" w:hint="default"/>
+      </w:rPr>
+    </w:lvl>
+    <w:lvl w:ilvl="2" w:tplc="04090005" w:tentative="1">
+      <w:start w:val="1"/>
+      <w:numFmt w:val="bullet"/>
+      <w:lvlText w:val=""/>
+      <w:lvlJc w:val="left"/>
+      <w:pPr>
+        <w:ind w:left="2160" w:hanging="360"/>
+      </w:pPr>
+      <w:rPr>
+        <w:rFonts w:ascii="Wingdings" w:hAnsi="Wingdings" w:hint="default"/>
+      </w:rPr>
+    </w:lvl>
+    <w:lvl w:ilvl="3" w:tplc="04090001" w:tentative="1">
+      <w:start w:val="1"/>
+      <w:numFmt w:val="bullet"/>
+      <w:lvlText w:val=""/>
+      <w:lvlJc w:val="left"/>
+      <w:pPr>
+        <w:ind w:left="2880" w:hanging="360"/>
+      </w:pPr>
+      <w:rPr>
+        <w:rFonts w:ascii="Symbol" w:hAnsi="Symbol" w:hint="default"/>
+      </w:rPr>
+    </w:lvl>
+    <w:lvl w:ilvl="4" w:tplc="04090003" w:tentative="1">
+      <w:start w:val="1"/>
+      <w:numFmt w:val="bullet"/>
+      <w:lvlText w:val="o"/>
+      <w:lvlJc w:val="left"/>
+      <w:pPr>
+        <w:ind w:left="3600" w:hanging="360"/>
+      </w:pPr>
+      <w:rPr>
+        <w:rFonts w:ascii="OCR A Std" w:hAnsi="OCR A Std" w:hint="default"/>
+      </w:rPr>
+    </w:lvl>
+    <w:lvl w:ilvl="5" w:tplc="04090005" w:tentative="1">
+      <w:start w:val="1"/>
+      <w:numFmt w:val="bullet"/>
+      <w:lvlText w:val=""/>
+      <w:lvlJc w:val="left"/>
+      <w:pPr>
+        <w:ind w:left="4320" w:hanging="360"/>
+      </w:pPr>
+      <w:rPr>
+        <w:rFonts w:ascii="Wingdings" w:hAnsi="Wingdings" w:hint="default"/>
+      </w:rPr>
+    </w:lvl>
+    <w:lvl w:ilvl="6" w:tplc="04090001" w:tentative="1">
+      <w:start w:val="1"/>
+      <w:numFmt w:val="bullet"/>
+      <w:lvlText w:val=""/>
+      <w:lvlJc w:val="left"/>
+      <w:pPr>
+        <w:ind w:left="5040" w:hanging="360"/>
+      </w:pPr>
+      <w:rPr>
+        <w:rFonts w:ascii="Symbol" w:hAnsi="Symbol" w:hint="default"/>
+      </w:rPr>
+    </w:lvl>
+    <w:lvl w:ilvl="7" w:tplc="04090003" w:tentative="1">
+      <w:start w:val="1"/>
+      <w:numFmt w:val="bullet"/>
+      <w:lvlText w:val="o"/>
+      <w:lvlJc w:val="left"/>
+      <w:pPr>
+        <w:ind w:left="5760" w:hanging="360"/>
+      </w:pPr>
+      <w:rPr>
+        <w:rFonts w:ascii="OCR A Std" w:hAnsi="OCR A Std" w:hint="default"/>
+      </w:rPr>
+    </w:lvl>
+    <w:lvl w:ilvl="8" w:tplc="04090005" w:tentative="1">
+      <w:start w:val="1"/>
+      <w:numFmt w:val="bullet"/>
+      <w:lvlText w:val=""/>
+      <w:lvlJc w:val="left"/>
+      <w:pPr>
+        <w:ind w:left="6480" w:hanging="360"/>
+      </w:pPr>
+      <w:rPr>
+        <w:rFonts w:ascii="Wingdings" w:hAnsi="Wingdings" w:hint="default"/>
+      </w:rPr>
+    </w:lvl>
+  </w:abstractNum>
+  <w:abstractNum w:abstractNumId="2" w15:restartNumberingAfterBreak="0">
     <w:nsid w:val="0D4A0215"/>
     <w:multiLevelType w:val="hybridMultilevel"/>
     <w:tmpl w:val="283E3644"/>
@@ -2958,7 +2838,7 @@
       </w:rPr>
     </w:lvl>
   </w:abstractNum>
-  <w:abstractNum w:abstractNumId="2" w15:restartNumberingAfterBreak="0">
+  <w:abstractNum w:abstractNumId="3" w15:restartNumberingAfterBreak="0">
     <w:nsid w:val="0FFB4152"/>
     <w:multiLevelType w:val="hybridMultilevel"/>
     <w:tmpl w:val="5064978E"/>
@@ -3071,7 +2951,7 @@
       </w:rPr>
     </w:lvl>
   </w:abstractNum>
-  <w:abstractNum w:abstractNumId="3" w15:restartNumberingAfterBreak="0">
+  <w:abstractNum w:abstractNumId="4" w15:restartNumberingAfterBreak="0">
     <w:nsid w:val="19883D9B"/>
     <w:multiLevelType w:val="hybridMultilevel"/>
     <w:tmpl w:val="21FC0F9E"/>
@@ -3184,7 +3064,7 @@
       </w:rPr>
     </w:lvl>
   </w:abstractNum>
-  <w:abstractNum w:abstractNumId="4" w15:restartNumberingAfterBreak="0">
+  <w:abstractNum w:abstractNumId="5" w15:restartNumberingAfterBreak="0">
     <w:nsid w:val="1A7B2212"/>
     <w:multiLevelType w:val="hybridMultilevel"/>
     <w:tmpl w:val="9F5C2D3E"/>
@@ -3297,7 +3177,7 @@
       </w:rPr>
     </w:lvl>
   </w:abstractNum>
-  <w:abstractNum w:abstractNumId="5" w15:restartNumberingAfterBreak="0">
+  <w:abstractNum w:abstractNumId="6" w15:restartNumberingAfterBreak="0">
     <w:nsid w:val="1E090216"/>
     <w:multiLevelType w:val="hybridMultilevel"/>
     <w:tmpl w:val="6EC60614"/>
@@ -3410,7 +3290,7 @@
       </w:rPr>
     </w:lvl>
   </w:abstractNum>
-  <w:abstractNum w:abstractNumId="6" w15:restartNumberingAfterBreak="0">
+  <w:abstractNum w:abstractNumId="7" w15:restartNumberingAfterBreak="0">
     <w:nsid w:val="20033D92"/>
     <w:multiLevelType w:val="hybridMultilevel"/>
     <w:tmpl w:val="8F5E958C"/>
@@ -3523,7 +3403,119 @@
       </w:rPr>
     </w:lvl>
   </w:abstractNum>
-  <w:abstractNum w:abstractNumId="7" w15:restartNumberingAfterBreak="0">
+  <w:abstractNum w:abstractNumId="8" w15:restartNumberingAfterBreak="0">
+    <w:nsid w:val="26B82B56"/>
+    <w:multiLevelType w:val="hybridMultilevel"/>
+    <w:tmpl w:val="4B5C5654"/>
+    <w:lvl w:ilvl="0" w:tplc="04090001">
+      <w:numFmt w:val="bullet"/>
+      <w:lvlText w:val=""/>
+      <w:lvlJc w:val="left"/>
+      <w:pPr>
+        <w:ind w:left="720" w:hanging="360"/>
+      </w:pPr>
+      <w:rPr>
+        <w:rFonts w:ascii="Symbol" w:eastAsia="Times New Roman" w:hAnsi="Symbol" w:cs="Times New Roman" w:hint="default"/>
+      </w:rPr>
+    </w:lvl>
+    <w:lvl w:ilvl="1" w:tplc="04090003" w:tentative="1">
+      <w:start w:val="1"/>
+      <w:numFmt w:val="bullet"/>
+      <w:lvlText w:val="o"/>
+      <w:lvlJc w:val="left"/>
+      <w:pPr>
+        <w:ind w:left="1440" w:hanging="360"/>
+      </w:pPr>
+      <w:rPr>
+        <w:rFonts w:ascii="OCR A Std" w:hAnsi="OCR A Std" w:hint="default"/>
+      </w:rPr>
+    </w:lvl>
+    <w:lvl w:ilvl="2" w:tplc="04090005" w:tentative="1">
+      <w:start w:val="1"/>
+      <w:numFmt w:val="bullet"/>
+      <w:lvlText w:val=""/>
+      <w:lvlJc w:val="left"/>
+      <w:pPr>
+        <w:ind w:left="2160" w:hanging="360"/>
+      </w:pPr>
+      <w:rPr>
+        <w:rFonts w:ascii="Wingdings" w:hAnsi="Wingdings" w:hint="default"/>
+      </w:rPr>
+    </w:lvl>
+    <w:lvl w:ilvl="3" w:tplc="04090001" w:tentative="1">
+      <w:start w:val="1"/>
+      <w:numFmt w:val="bullet"/>
+      <w:lvlText w:val=""/>
+      <w:lvlJc w:val="left"/>
+      <w:pPr>
+        <w:ind w:left="2880" w:hanging="360"/>
+      </w:pPr>
+      <w:rPr>
+        <w:rFonts w:ascii="Symbol" w:hAnsi="Symbol" w:hint="default"/>
+      </w:rPr>
+    </w:lvl>
+    <w:lvl w:ilvl="4" w:tplc="04090003" w:tentative="1">
+      <w:start w:val="1"/>
+      <w:numFmt w:val="bullet"/>
+      <w:lvlText w:val="o"/>
+      <w:lvlJc w:val="left"/>
+      <w:pPr>
+        <w:ind w:left="3600" w:hanging="360"/>
+      </w:pPr>
+      <w:rPr>
+        <w:rFonts w:ascii="OCR A Std" w:hAnsi="OCR A Std" w:hint="default"/>
+      </w:rPr>
+    </w:lvl>
+    <w:lvl w:ilvl="5" w:tplc="04090005" w:tentative="1">
+      <w:start w:val="1"/>
+      <w:numFmt w:val="bullet"/>
+      <w:lvlText w:val=""/>
+      <w:lvlJc w:val="left"/>
+      <w:pPr>
+        <w:ind w:left="4320" w:hanging="360"/>
+      </w:pPr>
+      <w:rPr>
+        <w:rFonts w:ascii="Wingdings" w:hAnsi="Wingdings" w:hint="default"/>
+      </w:rPr>
+    </w:lvl>
+    <w:lvl w:ilvl="6" w:tplc="04090001" w:tentative="1">
+      <w:start w:val="1"/>
+      <w:numFmt w:val="bullet"/>
+      <w:lvlText w:val=""/>
+      <w:lvlJc w:val="left"/>
+      <w:pPr>
+        <w:ind w:left="5040" w:hanging="360"/>
+      </w:pPr>
+      <w:rPr>
+        <w:rFonts w:ascii="Symbol" w:hAnsi="Symbol" w:hint="default"/>
+      </w:rPr>
+    </w:lvl>
+    <w:lvl w:ilvl="7" w:tplc="04090003" w:tentative="1">
+      <w:start w:val="1"/>
+      <w:numFmt w:val="bullet"/>
+      <w:lvlText w:val="o"/>
+      <w:lvlJc w:val="left"/>
+      <w:pPr>
+        <w:ind w:left="5760" w:hanging="360"/>
+      </w:pPr>
+      <w:rPr>
+        <w:rFonts w:ascii="OCR A Std" w:hAnsi="OCR A Std" w:hint="default"/>
+      </w:rPr>
+    </w:lvl>
+    <w:lvl w:ilvl="8" w:tplc="04090005" w:tentative="1">
+      <w:start w:val="1"/>
+      <w:numFmt w:val="bullet"/>
+      <w:lvlText w:val=""/>
+      <w:lvlJc w:val="left"/>
+      <w:pPr>
+        <w:ind w:left="6480" w:hanging="360"/>
+      </w:pPr>
+      <w:rPr>
+        <w:rFonts w:ascii="Wingdings" w:hAnsi="Wingdings" w:hint="default"/>
+      </w:rPr>
+    </w:lvl>
+  </w:abstractNum>
+  <w:abstractNum w:abstractNumId="9" w15:restartNumberingAfterBreak="0">
     <w:nsid w:val="2DD20356"/>
     <w:multiLevelType w:val="hybridMultilevel"/>
     <w:tmpl w:val="466ABA92"/>
@@ -3636,7 +3628,7 @@
       </w:rPr>
     </w:lvl>
   </w:abstractNum>
-  <w:abstractNum w:abstractNumId="8" w15:restartNumberingAfterBreak="0">
+  <w:abstractNum w:abstractNumId="10" w15:restartNumberingAfterBreak="0">
     <w:nsid w:val="3BC832B2"/>
     <w:multiLevelType w:val="hybridMultilevel"/>
     <w:tmpl w:val="039E1076"/>
@@ -3749,7 +3741,7 @@
       </w:rPr>
     </w:lvl>
   </w:abstractNum>
-  <w:abstractNum w:abstractNumId="9" w15:restartNumberingAfterBreak="0">
+  <w:abstractNum w:abstractNumId="11" w15:restartNumberingAfterBreak="0">
     <w:nsid w:val="4C947DBE"/>
     <w:multiLevelType w:val="hybridMultilevel"/>
     <w:tmpl w:val="4B6494A6"/>
@@ -3862,7 +3854,120 @@
       </w:rPr>
     </w:lvl>
   </w:abstractNum>
-  <w:abstractNum w:abstractNumId="10" w15:restartNumberingAfterBreak="0">
+  <w:abstractNum w:abstractNumId="12" w15:restartNumberingAfterBreak="0">
+    <w:nsid w:val="54F34826"/>
+    <w:multiLevelType w:val="hybridMultilevel"/>
+    <w:tmpl w:val="5010DA38"/>
+    <w:lvl w:ilvl="0" w:tplc="04090001">
+      <w:start w:val="1"/>
+      <w:numFmt w:val="bullet"/>
+      <w:lvlText w:val=""/>
+      <w:lvlJc w:val="left"/>
+      <w:pPr>
+        <w:ind w:left="720" w:hanging="360"/>
+      </w:pPr>
+      <w:rPr>
+        <w:rFonts w:ascii="Symbol" w:hAnsi="Symbol" w:hint="default"/>
+      </w:rPr>
+    </w:lvl>
+    <w:lvl w:ilvl="1" w:tplc="04090003" w:tentative="1">
+      <w:start w:val="1"/>
+      <w:numFmt w:val="bullet"/>
+      <w:lvlText w:val="o"/>
+      <w:lvlJc w:val="left"/>
+      <w:pPr>
+        <w:ind w:left="1440" w:hanging="360"/>
+      </w:pPr>
+      <w:rPr>
+        <w:rFonts w:ascii="OCR A Std" w:hAnsi="OCR A Std" w:hint="default"/>
+      </w:rPr>
+    </w:lvl>
+    <w:lvl w:ilvl="2" w:tplc="04090005" w:tentative="1">
+      <w:start w:val="1"/>
+      <w:numFmt w:val="bullet"/>
+      <w:lvlText w:val=""/>
+      <w:lvlJc w:val="left"/>
+      <w:pPr>
+        <w:ind w:left="2160" w:hanging="360"/>
+      </w:pPr>
+      <w:rPr>
+        <w:rFonts w:ascii="Wingdings" w:hAnsi="Wingdings" w:hint="default"/>
+      </w:rPr>
+    </w:lvl>
+    <w:lvl w:ilvl="3" w:tplc="04090001" w:tentative="1">
+      <w:start w:val="1"/>
+      <w:numFmt w:val="bullet"/>
+      <w:lvlText w:val=""/>
+      <w:lvlJc w:val="left"/>
+      <w:pPr>
+        <w:ind w:left="2880" w:hanging="360"/>
+      </w:pPr>
+      <w:rPr>
+        <w:rFonts w:ascii="Symbol" w:hAnsi="Symbol" w:hint="default"/>
+      </w:rPr>
+    </w:lvl>
+    <w:lvl w:ilvl="4" w:tplc="04090003" w:tentative="1">
+      <w:start w:val="1"/>
+      <w:numFmt w:val="bullet"/>
+      <w:lvlText w:val="o"/>
+      <w:lvlJc w:val="left"/>
+      <w:pPr>
+        <w:ind w:left="3600" w:hanging="360"/>
+      </w:pPr>
+      <w:rPr>
+        <w:rFonts w:ascii="OCR A Std" w:hAnsi="OCR A Std" w:hint="default"/>
+      </w:rPr>
+    </w:lvl>
+    <w:lvl w:ilvl="5" w:tplc="04090005" w:tentative="1">
+      <w:start w:val="1"/>
+      <w:numFmt w:val="bullet"/>
+      <w:lvlText w:val=""/>
+      <w:lvlJc w:val="left"/>
+      <w:pPr>
+        <w:ind w:left="4320" w:hanging="360"/>
+      </w:pPr>
+      <w:rPr>
+        <w:rFonts w:ascii="Wingdings" w:hAnsi="Wingdings" w:hint="default"/>
+      </w:rPr>
+    </w:lvl>
+    <w:lvl w:ilvl="6" w:tplc="04090001" w:tentative="1">
+      <w:start w:val="1"/>
+      <w:numFmt w:val="bullet"/>
+      <w:lvlText w:val=""/>
+      <w:lvlJc w:val="left"/>
+      <w:pPr>
+        <w:ind w:left="5040" w:hanging="360"/>
+      </w:pPr>
+      <w:rPr>
+        <w:rFonts w:ascii="Symbol" w:hAnsi="Symbol" w:hint="default"/>
+      </w:rPr>
+    </w:lvl>
+    <w:lvl w:ilvl="7" w:tplc="04090003" w:tentative="1">
+      <w:start w:val="1"/>
+      <w:numFmt w:val="bullet"/>
+      <w:lvlText w:val="o"/>
+      <w:lvlJc w:val="left"/>
+      <w:pPr>
+        <w:ind w:left="5760" w:hanging="360"/>
+      </w:pPr>
+      <w:rPr>
+        <w:rFonts w:ascii="OCR A Std" w:hAnsi="OCR A Std" w:hint="default"/>
+      </w:rPr>
+    </w:lvl>
+    <w:lvl w:ilvl="8" w:tplc="04090005" w:tentative="1">
+      <w:start w:val="1"/>
+      <w:numFmt w:val="bullet"/>
+      <w:lvlText w:val=""/>
+      <w:lvlJc w:val="left"/>
+      <w:pPr>
+        <w:ind w:left="6480" w:hanging="360"/>
+      </w:pPr>
+      <w:rPr>
+        <w:rFonts w:ascii="Wingdings" w:hAnsi="Wingdings" w:hint="default"/>
+      </w:rPr>
+    </w:lvl>
+  </w:abstractNum>
+  <w:abstractNum w:abstractNumId="13" w15:restartNumberingAfterBreak="0">
     <w:nsid w:val="5D153846"/>
     <w:multiLevelType w:val="multilevel"/>
     <w:tmpl w:val="0CAC9870"/>
@@ -4011,7 +4116,7 @@
       </w:rPr>
     </w:lvl>
   </w:abstractNum>
-  <w:abstractNum w:abstractNumId="11" w15:restartNumberingAfterBreak="0">
+  <w:abstractNum w:abstractNumId="14" w15:restartNumberingAfterBreak="0">
     <w:nsid w:val="5EA35570"/>
     <w:multiLevelType w:val="multilevel"/>
     <w:tmpl w:val="D42A0410"/>
@@ -4160,7 +4265,7 @@
       </w:rPr>
     </w:lvl>
   </w:abstractNum>
-  <w:abstractNum w:abstractNumId="12" w15:restartNumberingAfterBreak="0">
+  <w:abstractNum w:abstractNumId="15" w15:restartNumberingAfterBreak="0">
     <w:nsid w:val="6054534A"/>
     <w:multiLevelType w:val="hybridMultilevel"/>
     <w:tmpl w:val="281E699C"/>
@@ -4273,7 +4378,7 @@
       </w:rPr>
     </w:lvl>
   </w:abstractNum>
-  <w:abstractNum w:abstractNumId="13" w15:restartNumberingAfterBreak="0">
+  <w:abstractNum w:abstractNumId="16" w15:restartNumberingAfterBreak="0">
     <w:nsid w:val="697B57C7"/>
     <w:multiLevelType w:val="multilevel"/>
     <w:tmpl w:val="575496DE"/>
@@ -4422,7 +4527,7 @@
       </w:rPr>
     </w:lvl>
   </w:abstractNum>
-  <w:abstractNum w:abstractNumId="14" w15:restartNumberingAfterBreak="0">
+  <w:abstractNum w:abstractNumId="17" w15:restartNumberingAfterBreak="0">
     <w:nsid w:val="76F15EBA"/>
     <w:multiLevelType w:val="multilevel"/>
     <w:tmpl w:val="39EA11A2"/>
@@ -4566,7 +4671,7 @@
       </w:rPr>
     </w:lvl>
   </w:abstractNum>
-  <w:abstractNum w:abstractNumId="15" w15:restartNumberingAfterBreak="0">
+  <w:abstractNum w:abstractNumId="18" w15:restartNumberingAfterBreak="0">
     <w:nsid w:val="7B12249F"/>
     <w:multiLevelType w:val="hybridMultilevel"/>
     <w:tmpl w:val="1BBA00BE"/>
@@ -4679,7 +4784,7 @@
       </w:rPr>
     </w:lvl>
   </w:abstractNum>
-  <w:abstractNum w:abstractNumId="16" w15:restartNumberingAfterBreak="0">
+  <w:abstractNum w:abstractNumId="19" w15:restartNumberingAfterBreak="0">
     <w:nsid w:val="7F511B75"/>
     <w:multiLevelType w:val="hybridMultilevel"/>
     <w:tmpl w:val="FA287530"/>
@@ -4793,55 +4898,64 @@
     </w:lvl>
   </w:abstractNum>
   <w:num w:numId="1">
-    <w:abstractNumId w:val="8"/>
+    <w:abstractNumId w:val="10"/>
   </w:num>
   <w:num w:numId="2">
+    <w:abstractNumId w:val="18"/>
+  </w:num>
+  <w:num w:numId="3">
+    <w:abstractNumId w:val="5"/>
+  </w:num>
+  <w:num w:numId="4">
+    <w:abstractNumId w:val="4"/>
+  </w:num>
+  <w:num w:numId="5">
+    <w:abstractNumId w:val="19"/>
+  </w:num>
+  <w:num w:numId="6">
+    <w:abstractNumId w:val="16"/>
+  </w:num>
+  <w:num w:numId="7">
+    <w:abstractNumId w:val="11"/>
+  </w:num>
+  <w:num w:numId="8">
+    <w:abstractNumId w:val="7"/>
+  </w:num>
+  <w:num w:numId="9">
+    <w:abstractNumId w:val="13"/>
+  </w:num>
+  <w:num w:numId="10">
+    <w:abstractNumId w:val="14"/>
+  </w:num>
+  <w:num w:numId="11">
+    <w:abstractNumId w:val="17"/>
+  </w:num>
+  <w:num w:numId="12">
+    <w:abstractNumId w:val="9"/>
+  </w:num>
+  <w:num w:numId="13">
     <w:abstractNumId w:val="15"/>
   </w:num>
-  <w:num w:numId="3">
-    <w:abstractNumId w:val="4"/>
-  </w:num>
-  <w:num w:numId="4">
-    <w:abstractNumId w:val="3"/>
-  </w:num>
-  <w:num w:numId="5">
-    <w:abstractNumId w:val="16"/>
-  </w:num>
-  <w:num w:numId="6">
-    <w:abstractNumId w:val="13"/>
-  </w:num>
-  <w:num w:numId="7">
-    <w:abstractNumId w:val="9"/>
-  </w:num>
-  <w:num w:numId="8">
+  <w:num w:numId="14">
     <w:abstractNumId w:val="6"/>
-  </w:num>
-  <w:num w:numId="9">
-    <w:abstractNumId w:val="10"/>
-  </w:num>
-  <w:num w:numId="10">
-    <w:abstractNumId w:val="11"/>
-  </w:num>
-  <w:num w:numId="11">
-    <w:abstractNumId w:val="14"/>
-  </w:num>
-  <w:num w:numId="12">
-    <w:abstractNumId w:val="7"/>
-  </w:num>
-  <w:num w:numId="13">
-    <w:abstractNumId w:val="12"/>
-  </w:num>
-  <w:num w:numId="14">
-    <w:abstractNumId w:val="5"/>
   </w:num>
   <w:num w:numId="15">
     <w:abstractNumId w:val="0"/>
   </w:num>
   <w:num w:numId="16">
-    <w:abstractNumId w:val="1"/>
+    <w:abstractNumId w:val="2"/>
   </w:num>
   <w:num w:numId="17">
-    <w:abstractNumId w:val="2"/>
+    <w:abstractNumId w:val="3"/>
+  </w:num>
+  <w:num w:numId="18">
+    <w:abstractNumId w:val="12"/>
+  </w:num>
+  <w:num w:numId="19">
+    <w:abstractNumId w:val="8"/>
+  </w:num>
+  <w:num w:numId="20">
+    <w:abstractNumId w:val="1"/>
   </w:num>
 </w:numbering>
 </file>
@@ -5239,7 +5353,7 @@
   <w:style w:type="paragraph" w:default="1" w:styleId="Normal">
     <w:name w:val="Normal"/>
     <w:qFormat/>
-    <w:rsid w:val="002903F4"/>
+    <w:rsid w:val="00E62264"/>
     <w:rPr>
       <w:kern w:val="2"/>
       <w:lang w:val="en-IN"/>
@@ -5266,6 +5380,27 @@
       <w:szCs w:val="36"/>
       <w:lang w:val="en-US"/>
       <w14:ligatures w14:val="none"/>
+    </w:rPr>
+  </w:style>
+  <w:style w:type="paragraph" w:styleId="Heading5">
+    <w:name w:val="heading 5"/>
+    <w:basedOn w:val="Normal"/>
+    <w:next w:val="Normal"/>
+    <w:link w:val="Heading5Char"/>
+    <w:uiPriority w:val="9"/>
+    <w:semiHidden/>
+    <w:unhideWhenUsed/>
+    <w:qFormat/>
+    <w:rsid w:val="00093099"/>
+    <w:pPr>
+      <w:keepNext/>
+      <w:keepLines/>
+      <w:spacing w:before="40" w:after="0"/>
+      <w:outlineLvl w:val="4"/>
+    </w:pPr>
+    <w:rPr>
+      <w:rFonts w:asciiTheme="majorHAnsi" w:eastAsiaTheme="majorEastAsia" w:hAnsiTheme="majorHAnsi" w:cstheme="majorBidi"/>
+      <w:color w:val="2E74B5" w:themeColor="accent1" w:themeShade="BF"/>
     </w:rPr>
   </w:style>
   <w:style w:type="character" w:default="1" w:styleId="DefaultParagraphFont">
@@ -5369,6 +5504,33 @@
     <w:rPr>
       <w:i/>
       <w:iCs/>
+    </w:rPr>
+  </w:style>
+  <w:style w:type="character" w:customStyle="1" w:styleId="Heading5Char">
+    <w:name w:val="Heading 5 Char"/>
+    <w:basedOn w:val="DefaultParagraphFont"/>
+    <w:link w:val="Heading5"/>
+    <w:uiPriority w:val="9"/>
+    <w:semiHidden/>
+    <w:rsid w:val="00093099"/>
+    <w:rPr>
+      <w:rFonts w:asciiTheme="majorHAnsi" w:eastAsiaTheme="majorEastAsia" w:hAnsiTheme="majorHAnsi" w:cstheme="majorBidi"/>
+      <w:color w:val="2E74B5" w:themeColor="accent1" w:themeShade="BF"/>
+      <w:kern w:val="2"/>
+      <w:lang w:val="en-IN"/>
+      <w14:ligatures w14:val="standardContextual"/>
+    </w:rPr>
+  </w:style>
+  <w:style w:type="character" w:styleId="FollowedHyperlink">
+    <w:name w:val="FollowedHyperlink"/>
+    <w:basedOn w:val="DefaultParagraphFont"/>
+    <w:uiPriority w:val="99"/>
+    <w:semiHidden/>
+    <w:unhideWhenUsed/>
+    <w:rsid w:val="002E1220"/>
+    <w:rPr>
+      <w:color w:val="954F72" w:themeColor="followedHyperlink"/>
+      <w:u w:val="single"/>
     </w:rPr>
   </w:style>
 </w:styles>

</xml_diff>